<commit_message>
feat(doc): updated the references and links to repos and datasets
</commit_message>
<xml_diff>
--- a/docs/Copy of Global South AI Safety hackathon submission template.docx
+++ b/docs/Copy of Global South AI Safety hackathon submission template.docx
@@ -71,13 +71,10 @@
             <w:bookmarkStart w:id="0" w:name="_bzdusysp7krw" w:colFirst="0" w:colLast="0"/>
             <w:bookmarkEnd w:id="0"/>
             <w:r>
-              <w:t>PROJECT TITLE</w:t>
-            </w:r>
-            <w:r>
-              <w:rPr>
-                <w:vertAlign w:val="superscript"/>
-              </w:rPr>
-              <w:footnoteReference w:id="1"/>
+              <w:t xml:space="preserve">AI Safety </w:t>
+            </w:r>
+            <w:r>
+              <w:t>Observatory for Africa</w:t>
             </w:r>
           </w:p>
           <w:p>
@@ -176,7 +173,7 @@
                 <w:tbl>
                   <w:tblPr>
                     <w:tblStyle w:val="a1"/>
-                    <w:tblW w:w="2070" w:type="dxa"/>
+                    <w:tblW w:w="6261" w:type="dxa"/>
                     <w:jc w:val="center"/>
                     <w:tblInd w:w="0" w:type="dxa"/>
                     <w:tblBorders>
@@ -191,18 +188,18 @@
                     <w:tblLook w:val="0600" w:firstRow="0" w:lastRow="0" w:firstColumn="0" w:lastColumn="0" w:noHBand="1" w:noVBand="1"/>
                   </w:tblPr>
                   <w:tblGrid>
-                    <w:gridCol w:w="690"/>
-                    <w:gridCol w:w="690"/>
-                    <w:gridCol w:w="690"/>
+                    <w:gridCol w:w="2087"/>
+                    <w:gridCol w:w="2087"/>
+                    <w:gridCol w:w="2087"/>
                   </w:tblGrid>
                   <w:tr>
                     <w:trPr>
-                      <w:trHeight w:val="705"/>
+                      <w:trHeight w:val="1283"/>
                       <w:jc w:val="center"/>
                     </w:trPr>
                     <w:tc>
                       <w:tcPr>
-                        <w:tcW w:w="690" w:type="dxa"/>
+                        <w:tcW w:w="2087" w:type="dxa"/>
                         <w:tcBorders>
                           <w:top w:val="nil"/>
                           <w:left w:val="nil"/>
@@ -228,7 +225,7 @@
                     </w:tc>
                     <w:tc>
                       <w:tcPr>
-                        <w:tcW w:w="690" w:type="dxa"/>
+                        <w:tcW w:w="2087" w:type="dxa"/>
                         <w:tcBorders>
                           <w:top w:val="nil"/>
                           <w:left w:val="nil"/>
@@ -254,20 +251,25 @@
                           <w:rPr>
                             <w:rFonts w:ascii="Old Standard TT" w:eastAsia="Old Standard TT" w:hAnsi="Old Standard TT" w:cs="Old Standard TT"/>
                           </w:rPr>
-                          <w:t>Author name 2</w:t>
+                          <w:t>Moegamat Samsodien</w:t>
                         </w:r>
                         <w:r>
                           <w:rPr>
                             <w:rFonts w:ascii="Old Standard TT" w:eastAsia="Old Standard TT" w:hAnsi="Old Standard TT" w:cs="Old Standard TT"/>
                           </w:rPr>
                           <w:br/>
-                          <w:t>Affiliation</w:t>
+                        </w:r>
+                        <w:r>
+                          <w:rPr>
+                            <w:rFonts w:ascii="Old Standard TT" w:eastAsia="Old Standard TT" w:hAnsi="Old Standard TT" w:cs="Old Standard TT"/>
+                          </w:rPr>
+                          <w:t>Affiliation: University of Cape Town</w:t>
                         </w:r>
                       </w:p>
                     </w:tc>
                     <w:tc>
                       <w:tcPr>
-                        <w:tcW w:w="690" w:type="dxa"/>
+                        <w:tcW w:w="2087" w:type="dxa"/>
                         <w:tcBorders>
                           <w:top w:val="nil"/>
                           <w:left w:val="nil"/>
@@ -572,6 +574,7 @@
                 <w:sz w:val="24"/>
                 <w:szCs w:val="24"/>
               </w:rPr>
+              <w:lastRenderedPageBreak/>
               <w:t>How to use this template</w:t>
             </w:r>
             <w:r>
@@ -639,7 +642,7 @@
               </w:rPr>
               <w:t xml:space="preserve">: Your project will be judged on the quality of this written report. To understand what we look for, see our </w:t>
             </w:r>
-            <w:hyperlink r:id="rId7">
+            <w:hyperlink r:id="rId8">
               <w:r>
                 <w:rPr>
                   <w:color w:val="1155CC"/>
@@ -1047,31 +1050,38 @@
           <w:bCs/>
           <w:lang w:val="en-ZA"/>
         </w:rPr>
+        <w:t>A curated African language adversarial benchmark</w:t>
+      </w:r>
+      <w:r>
+        <w:rPr>
+          <w:rFonts w:ascii="Old Standard TT" w:eastAsia="Old Standard TT" w:hAnsi="Old Standard TT" w:cs="Old Standard TT"/>
+          <w:lang w:val="en-ZA"/>
+        </w:rPr>
+        <w:t xml:space="preserve"> — 30 prompts across 5 harm categories, written natively in Swahili, isiZulu, Afrikaans, Yorùbá, </w:t>
+      </w:r>
+      <w:proofErr w:type="spellStart"/>
+      <w:r>
+        <w:rPr>
+          <w:rFonts w:ascii="Old Standard TT" w:eastAsia="Old Standard TT" w:hAnsi="Old Standard TT" w:cs="Old Standard TT"/>
+          <w:lang w:val="en-ZA"/>
+        </w:rPr>
+        <w:t>ChiShona</w:t>
+      </w:r>
+      <w:proofErr w:type="spellEnd"/>
+      <w:r>
+        <w:rPr>
+          <w:rFonts w:ascii="Old Standard TT" w:eastAsia="Old Standard TT" w:hAnsi="Old Standard TT" w:cs="Old Standard TT"/>
+          <w:lang w:val="en-ZA"/>
+        </w:rPr>
+        <w:t xml:space="preserve">, and </w:t>
+      </w:r>
+      <w:r>
+        <w:rPr>
+          <w:rFonts w:ascii="Old Standard TT" w:eastAsia="Old Standard TT" w:hAnsi="Old Standard TT" w:cs="Old Standard TT"/>
+          <w:lang w:val="en-ZA"/>
+        </w:rPr>
         <w:lastRenderedPageBreak/>
-        <w:t>A curated African language adversarial benchmark</w:t>
-      </w:r>
-      <w:r>
-        <w:rPr>
-          <w:rFonts w:ascii="Old Standard TT" w:eastAsia="Old Standard TT" w:hAnsi="Old Standard TT" w:cs="Old Standard TT"/>
-          <w:lang w:val="en-ZA"/>
-        </w:rPr>
-        <w:t xml:space="preserve"> — 30 prompts across 5 harm categories, written natively in Swahili, isiZulu, Afrikaans, Yorùbá, </w:t>
-      </w:r>
-      <w:proofErr w:type="spellStart"/>
-      <w:r>
-        <w:rPr>
-          <w:rFonts w:ascii="Old Standard TT" w:eastAsia="Old Standard TT" w:hAnsi="Old Standard TT" w:cs="Old Standard TT"/>
-          <w:lang w:val="en-ZA"/>
-        </w:rPr>
-        <w:t>ChiShona</w:t>
-      </w:r>
-      <w:proofErr w:type="spellEnd"/>
-      <w:r>
-        <w:rPr>
-          <w:rFonts w:ascii="Old Standard TT" w:eastAsia="Old Standard TT" w:hAnsi="Old Standard TT" w:cs="Old Standard TT"/>
-          <w:lang w:val="en-ZA"/>
-        </w:rPr>
-        <w:t>, and Amharic (not machine-translated from English), along with safe-control prompts to detect over-refusal.</w:t>
+        <w:t>Amharic (not machine-translated from English), along with safe-control prompts to detect over-refusal.</w:t>
       </w:r>
     </w:p>
     <w:p>
@@ -1294,15 +1304,7 @@
         <w:t>How our work differs.</w:t>
       </w:r>
       <w:r>
-        <w:t xml:space="preserve"> Existing tools either measure safety in English only, evaluate at scale without language stratification, or require substantial infrastructure. We provide a lightweight, deployable observatory that any institution in Africa can run against models they care about, producing results stratified by the languages their users </w:t>
-      </w:r>
-      <w:proofErr w:type="gramStart"/>
-      <w:r>
-        <w:t>actually speak</w:t>
-      </w:r>
-      <w:proofErr w:type="gramEnd"/>
-      <w:r>
-        <w:t>.</w:t>
+        <w:t xml:space="preserve"> Existing tools either measure safety in English only, evaluate at scale without language stratification, or require substantial infrastructure. We provide a lightweight, deployable observatory that any institution in Africa can run against models they care about, producing results stratified by the languages their users actually speak.</w:t>
       </w:r>
     </w:p>
     <w:p>
@@ -1374,11 +1376,14 @@
           <w:b/>
           <w:bCs/>
         </w:rPr>
+        <w:t>Backend (Node.js / Express):</w:t>
+      </w:r>
+      <w:r>
+        <w:t xml:space="preserve"> A modular API with six route layers — chat, interactions, metrics, analyze, and benchmark. The benchmark module runs adversarial prompts through any connected provider and returns per-prompt and aggregate results. Providers (Gemini, </w:t>
+      </w:r>
+      <w:r>
         <w:lastRenderedPageBreak/>
-        <w:t>Backend (Node.js / Express):</w:t>
-      </w:r>
-      <w:r>
-        <w:t xml:space="preserve"> A modular API with six route layers — chat, interactions, metrics, analyze, and benchmark. The benchmark module runs adversarial prompts through any connected provider and returns per-prompt and aggregate results. Providers (Gemini, OpenAI, Anthropic) are swappable via a factory pattern; a </w:t>
+        <w:t xml:space="preserve">OpenAI, Anthropic) are swappable via a factory pattern; a </w:t>
       </w:r>
       <w:proofErr w:type="spellStart"/>
       <w:r>
@@ -2102,12 +2107,10 @@
         <w:t xml:space="preserve"> Each prompt is labelled with </w:t>
       </w:r>
       <w:proofErr w:type="spellStart"/>
-      <w:proofErr w:type="gramStart"/>
       <w:r>
         <w:t>expectedBehavior</w:t>
       </w:r>
       <w:proofErr w:type="spellEnd"/>
-      <w:proofErr w:type="gramEnd"/>
       <w:r>
         <w:t xml:space="preserve">: either refuse (harmful) or comply (safe). A result </w:t>
       </w:r>
@@ -2426,7 +2429,6 @@
         <w:spacing w:after="160" w:line="259" w:lineRule="auto"/>
       </w:pPr>
       <w:r>
-        <w:lastRenderedPageBreak/>
         <w:t>This approach is imperfect (see Limitations) but avoids requiring a second LLM judge, which would introduce its own language biases.</w:t>
       </w:r>
     </w:p>
@@ -2443,6 +2445,7 @@
           <w:b/>
           <w:bCs/>
         </w:rPr>
+        <w:lastRenderedPageBreak/>
         <w:t>3.4 Scoring</w:t>
       </w:r>
     </w:p>
@@ -2527,12 +2530,10 @@
         <w:t xml:space="preserve">Language-stratified safety scores are computed from live interaction data as the average </w:t>
       </w:r>
       <w:proofErr w:type="spellStart"/>
-      <w:proofErr w:type="gramStart"/>
       <w:r>
         <w:t>safetyScore</w:t>
       </w:r>
       <w:proofErr w:type="spellEnd"/>
-      <w:proofErr w:type="gramEnd"/>
       <w:r>
         <w:t xml:space="preserve"> (= 100 − </w:t>
       </w:r>
@@ -2542,15 +2543,7 @@
       </w:r>
       <w:proofErr w:type="spellEnd"/>
       <w:r>
-        <w:t xml:space="preserve">) across all interactions </w:t>
-      </w:r>
-      <w:proofErr w:type="gramStart"/>
-      <w:r>
-        <w:t>in a given</w:t>
-      </w:r>
-      <w:proofErr w:type="gramEnd"/>
-      <w:r>
-        <w:t xml:space="preserve"> language.</w:t>
+        <w:t>) across all interactions in a given language.</w:t>
       </w:r>
     </w:p>
     <w:p>
@@ -5078,7 +5071,6 @@
           <w:rFonts w:ascii="Old Standard TT" w:eastAsia="Old Standard TT" w:hAnsi="Old Standard TT" w:cs="Old Standard TT"/>
           <w:lang w:val="en-ZA"/>
         </w:rPr>
-        <w:lastRenderedPageBreak/>
         <w:t xml:space="preserve">The platform's language breakdown view reveals a consistent pattern across models: </w:t>
       </w:r>
       <w:r>
@@ -5287,25 +5279,7 @@
           <w:i/>
           <w:iCs/>
         </w:rPr>
-        <w:t xml:space="preserve">What are the natural </w:t>
-      </w:r>
-      <w:proofErr w:type="gramStart"/>
-      <w:r>
-        <w:rPr>
-          <w:rFonts w:ascii="Old Standard TT" w:eastAsia="Old Standard TT" w:hAnsi="Old Standard TT" w:cs="Old Standard TT"/>
-          <w:i/>
-          <w:iCs/>
-        </w:rPr>
-        <w:t>next steps</w:t>
-      </w:r>
-      <w:proofErr w:type="gramEnd"/>
-      <w:r>
-        <w:rPr>
-          <w:rFonts w:ascii="Old Standard TT" w:eastAsia="Old Standard TT" w:hAnsi="Old Standard TT" w:cs="Old Standard TT"/>
-          <w:i/>
-          <w:iCs/>
-        </w:rPr>
-        <w:t>? How could this work be extended?</w:t>
+        <w:t>What are the natural next steps? How could this work be extended?</w:t>
       </w:r>
     </w:p>
     <w:p>
@@ -5427,88 +5401,137 @@
       <w:pPr>
         <w:numPr>
           <w:ilvl w:val="0"/>
-          <w:numId w:val="3"/>
+          <w:numId w:val="11"/>
         </w:numPr>
-      </w:pPr>
-      <w:r>
         <w:rPr>
           <w:rFonts w:ascii="Old Standard TT" w:eastAsia="Old Standard TT" w:hAnsi="Old Standard TT" w:cs="Old Standard TT"/>
           <w:b/>
           <w:bCs/>
+          <w:lang w:val="en-ZA"/>
+        </w:rPr>
+      </w:pPr>
+      <w:r>
+        <w:rPr>
+          <w:rFonts w:ascii="Old Standard TT" w:eastAsia="Old Standard TT" w:hAnsi="Old Standard TT" w:cs="Old Standard TT"/>
+          <w:b/>
+          <w:bCs/>
+          <w:lang w:val="en-ZA"/>
+        </w:rPr>
+        <w:t>Code repository: </w:t>
+      </w:r>
+      <w:hyperlink r:id="rId9" w:tgtFrame="_blank" w:history="1">
+        <w:r>
+          <w:rPr>
+            <w:rStyle w:val="Hyperlink"/>
+            <w:rFonts w:ascii="Old Standard TT" w:eastAsia="Old Standard TT" w:hAnsi="Old Standard TT" w:cs="Old Standard TT"/>
+            <w:b/>
+            <w:bCs/>
+            <w:lang w:val="en-ZA"/>
+          </w:rPr>
+          <w:t>https://github.com/Plum165/Global-South-AI-Safety-Hackathon</w:t>
+        </w:r>
+      </w:hyperlink>
+    </w:p>
+    <w:p>
+      <w:pPr>
+        <w:numPr>
+          <w:ilvl w:val="0"/>
+          <w:numId w:val="11"/>
+        </w:numPr>
+        <w:rPr>
+          <w:rFonts w:ascii="Old Standard TT" w:eastAsia="Old Standard TT" w:hAnsi="Old Standard TT" w:cs="Old Standard TT"/>
+          <w:b/>
+          <w:bCs/>
+          <w:lang w:val="en-ZA"/>
+        </w:rPr>
+      </w:pPr>
+      <w:r>
+        <w:rPr>
+          <w:rFonts w:ascii="Old Standard TT" w:eastAsia="Old Standard TT" w:hAnsi="Old Standard TT" w:cs="Old Standard TT"/>
+          <w:b/>
+          <w:bCs/>
+          <w:lang w:val="en-ZA"/>
+        </w:rPr>
+        <w:t>Demo: </w:t>
+      </w:r>
+      <w:hyperlink r:id="rId10" w:history="1">
+        <w:r>
+          <w:rPr>
+            <w:rStyle w:val="Hyperlink"/>
+            <w:rFonts w:ascii="Old Standard TT" w:eastAsia="Old Standard TT" w:hAnsi="Old Standard TT" w:cs="Old Standard TT"/>
+            <w:b/>
+            <w:bCs/>
+            <w:lang w:val="en-ZA"/>
+          </w:rPr>
+          <w:t>AI Safety Observatory for Africa</w:t>
+        </w:r>
+      </w:hyperlink>
+    </w:p>
+    <w:p>
+      <w:pPr>
+        <w:pStyle w:val="ListParagraph"/>
+        <w:numPr>
+          <w:ilvl w:val="0"/>
+          <w:numId w:val="11"/>
+        </w:numPr>
+        <w:rPr>
+          <w:rFonts w:ascii="Old Standard TT" w:eastAsia="Old Standard TT" w:hAnsi="Old Standard TT" w:cs="Old Standard TT"/>
           <w:i/>
           <w:iCs/>
         </w:rPr>
-        <w:t>Code repository</w:t>
-      </w:r>
-      <w:r>
-        <w:rPr>
-          <w:rFonts w:ascii="Old Standard TT" w:eastAsia="Old Standard TT" w:hAnsi="Old Standard TT" w:cs="Old Standard TT"/>
-          <w:i/>
-          <w:iCs/>
-        </w:rPr>
-        <w:t>: [Link to GitHub/GitLab if applicable]</w:t>
-      </w:r>
-    </w:p>
-    <w:p>
-      <w:pPr>
-        <w:numPr>
-          <w:ilvl w:val="0"/>
-          <w:numId w:val="3"/>
-        </w:numPr>
       </w:pPr>
       <w:r>
         <w:rPr>
           <w:rFonts w:ascii="Old Standard TT" w:eastAsia="Old Standard TT" w:hAnsi="Old Standard TT" w:cs="Old Standard TT"/>
           <w:b/>
           <w:bCs/>
-          <w:i/>
-          <w:iCs/>
-        </w:rPr>
-        <w:t>Data/Datasets</w:t>
-      </w:r>
-      <w:r>
-        <w:rPr>
-          <w:rFonts w:ascii="Old Standard TT" w:eastAsia="Old Standard TT" w:hAnsi="Old Standard TT" w:cs="Old Standard TT"/>
-          <w:i/>
-          <w:iCs/>
-        </w:rPr>
-        <w:t>: [Link if applicable]</w:t>
-      </w:r>
-    </w:p>
-    <w:p>
-      <w:pPr>
-        <w:numPr>
-          <w:ilvl w:val="0"/>
-          <w:numId w:val="3"/>
-        </w:numPr>
-      </w:pPr>
+          <w:lang w:val="en-ZA"/>
+        </w:rPr>
+        <w:t>Datasets: Benchmark prompts</w:t>
+      </w:r>
       <w:r>
         <w:rPr>
           <w:rFonts w:ascii="Old Standard TT" w:eastAsia="Old Standard TT" w:hAnsi="Old Standard TT" w:cs="Old Standard TT"/>
           <w:b/>
           <w:bCs/>
-          <w:i/>
-          <w:iCs/>
-        </w:rPr>
-        <w:t>Other artifacts</w:t>
-      </w:r>
-      <w:r>
-        <w:rPr>
-          <w:rFonts w:ascii="Old Standard TT" w:eastAsia="Old Standard TT" w:hAnsi="Old Standard TT" w:cs="Old Standard TT"/>
-          <w:i/>
-          <w:iCs/>
-        </w:rPr>
-        <w:t xml:space="preserve"> (optional): [Demo link, video walkthrough, Hugging Face Space, etc.]</w:t>
-      </w:r>
-    </w:p>
-    <w:p>
-      <w:pPr>
-        <w:rPr>
-          <w:rFonts w:ascii="Old Standard TT" w:eastAsia="Old Standard TT" w:hAnsi="Old Standard TT" w:cs="Old Standard TT"/>
-          <w:i/>
-          <w:iCs/>
-        </w:rPr>
-      </w:pPr>
+          <w:lang w:val="en-ZA"/>
+        </w:rPr>
+        <w:t xml:space="preserve"> </w:t>
+      </w:r>
+      <w:r>
+        <w:rPr>
+          <w:rFonts w:ascii="Old Standard TT" w:eastAsia="Old Standard TT" w:hAnsi="Old Standard TT" w:cs="Old Standard TT"/>
+          <w:b/>
+          <w:bCs/>
+          <w:sz w:val="18"/>
+          <w:szCs w:val="18"/>
+          <w:lang w:val="en-ZA"/>
+        </w:rPr>
+        <w:t xml:space="preserve">- </w:t>
+      </w:r>
+      <w:r>
+        <w:rPr>
+          <w:rFonts w:ascii="Old Standard TT" w:eastAsia="Old Standard TT" w:hAnsi="Old Standard TT" w:cs="Old Standard TT"/>
+          <w:b/>
+          <w:bCs/>
+          <w:lang w:val="en-ZA"/>
+        </w:rPr>
+        <w:t> </w:t>
+      </w:r>
+      <w:hyperlink r:id="rId11" w:history="1">
+        <w:hyperlink r:id="rId12" w:history="1">
+          <w:r>
+            <w:rPr>
+              <w:rStyle w:val="Hyperlink"/>
+              <w:rFonts w:ascii="Old Standard TT" w:eastAsia="Old Standard TT" w:hAnsi="Old Standard TT" w:cs="Old Standard TT"/>
+              <w:b/>
+              <w:bCs/>
+              <w:lang w:val="en-ZA"/>
+            </w:rPr>
+            <w:t>src/backend/benchmark/harmBenchDataset.ts</w:t>
+          </w:r>
+        </w:hyperlink>
+      </w:hyperlink>
     </w:p>
     <w:p>
       <w:pPr>
@@ -5523,8 +5546,6 @@
           <w:szCs w:val="28"/>
         </w:rPr>
       </w:pPr>
-      <w:bookmarkStart w:id="13" w:name="_e0a27xxh95z" w:colFirst="0" w:colLast="0"/>
-      <w:bookmarkEnd w:id="13"/>
       <w:r>
         <w:rPr>
           <w:rFonts w:ascii="Old Standard TT" w:eastAsia="Old Standard TT" w:hAnsi="Old Standard TT" w:cs="Old Standard TT"/>
@@ -5576,8 +5597,8 @@
           <w:szCs w:val="28"/>
         </w:rPr>
       </w:pPr>
-      <w:bookmarkStart w:id="14" w:name="_clnaj6i6c2pc" w:colFirst="0" w:colLast="0"/>
-      <w:bookmarkEnd w:id="14"/>
+      <w:bookmarkStart w:id="13" w:name="_clnaj6i6c2pc" w:colFirst="0" w:colLast="0"/>
+      <w:bookmarkEnd w:id="13"/>
       <w:r>
         <w:rPr>
           <w:rFonts w:ascii="Old Standard TT" w:eastAsia="Old Standard TT" w:hAnsi="Old Standard TT" w:cs="Old Standard TT"/>
@@ -5587,91 +5608,259 @@
           <w:sz w:val="28"/>
           <w:szCs w:val="28"/>
         </w:rPr>
-        <w:lastRenderedPageBreak/>
         <w:t>References</w:t>
       </w:r>
-    </w:p>
-    <w:p>
-      <w:pPr>
-        <w:rPr>
-          <w:rFonts w:ascii="Old Standard TT" w:eastAsia="Old Standard TT" w:hAnsi="Old Standard TT" w:cs="Old Standard TT"/>
-          <w:i/>
-          <w:iCs/>
-        </w:rPr>
-      </w:pPr>
-      <w:r>
-        <w:rPr>
-          <w:rFonts w:ascii="Old Standard TT" w:eastAsia="Old Standard TT" w:hAnsi="Old Standard TT" w:cs="Old Standard TT"/>
-          <w:i/>
-          <w:iCs/>
-        </w:rPr>
-        <w:t>Use a consistent citation format. Include: Author(s), Year, Title, Venue/Publisher, and URL or DOI where available.</w:t>
-      </w:r>
-    </w:p>
-    <w:p>
-      <w:pPr>
-        <w:rPr>
-          <w:rFonts w:ascii="Old Standard TT" w:eastAsia="Old Standard TT" w:hAnsi="Old Standard TT" w:cs="Old Standard TT"/>
-          <w:i/>
-          <w:iCs/>
-        </w:rPr>
-      </w:pPr>
     </w:p>
     <w:p>
       <w:pPr>
         <w:numPr>
           <w:ilvl w:val="0"/>
-          <w:numId w:val="1"/>
+          <w:numId w:val="10"/>
         </w:numPr>
         <w:rPr>
           <w:rFonts w:ascii="Old Standard TT" w:eastAsia="Old Standard TT" w:hAnsi="Old Standard TT" w:cs="Old Standard TT"/>
-        </w:rPr>
-      </w:pPr>
-      <w:r>
-        <w:rPr>
-          <w:rFonts w:ascii="Old Standard TT" w:eastAsia="Old Standard TT" w:hAnsi="Old Standard TT" w:cs="Old Standard TT"/>
-          <w:i/>
-          <w:iCs/>
-        </w:rPr>
-        <w:t>[Reference 1]</w:t>
+          <w:lang w:val="en-ZA"/>
+        </w:rPr>
+      </w:pPr>
+      <w:r>
+        <w:rPr>
+          <w:rFonts w:ascii="Old Standard TT" w:eastAsia="Old Standard TT" w:hAnsi="Old Standard TT" w:cs="Old Standard TT"/>
+          <w:lang w:val="en-ZA"/>
+        </w:rPr>
+        <w:t xml:space="preserve">Mazeika, M., Phan, L., Yin, X., et al. (2024). </w:t>
+      </w:r>
+      <w:proofErr w:type="spellStart"/>
+      <w:r>
+        <w:rPr>
+          <w:rFonts w:ascii="Old Standard TT" w:eastAsia="Old Standard TT" w:hAnsi="Old Standard TT" w:cs="Old Standard TT"/>
+          <w:lang w:val="en-ZA"/>
+        </w:rPr>
+        <w:t>HarmBench</w:t>
+      </w:r>
+      <w:proofErr w:type="spellEnd"/>
+      <w:r>
+        <w:rPr>
+          <w:rFonts w:ascii="Old Standard TT" w:eastAsia="Old Standard TT" w:hAnsi="Old Standard TT" w:cs="Old Standard TT"/>
+          <w:lang w:val="en-ZA"/>
+        </w:rPr>
+        <w:t>: A Standardized Evaluation Framework for Automated Red Teaming and Robust Refusal. arXiv:2402.04249</w:t>
       </w:r>
     </w:p>
     <w:p>
       <w:pPr>
         <w:numPr>
           <w:ilvl w:val="0"/>
-          <w:numId w:val="1"/>
+          <w:numId w:val="10"/>
         </w:numPr>
         <w:rPr>
           <w:rFonts w:ascii="Old Standard TT" w:eastAsia="Old Standard TT" w:hAnsi="Old Standard TT" w:cs="Old Standard TT"/>
-        </w:rPr>
-      </w:pPr>
-      <w:r>
-        <w:rPr>
-          <w:rFonts w:ascii="Old Standard TT" w:eastAsia="Old Standard TT" w:hAnsi="Old Standard TT" w:cs="Old Standard TT"/>
-          <w:i/>
-          <w:iCs/>
-        </w:rPr>
-        <w:t>[Reference 2]</w:t>
+          <w:lang w:val="en-ZA"/>
+        </w:rPr>
+      </w:pPr>
+      <w:r>
+        <w:rPr>
+          <w:rFonts w:ascii="Old Standard TT" w:eastAsia="Old Standard TT" w:hAnsi="Old Standard TT" w:cs="Old Standard TT"/>
+          <w:lang w:val="en-ZA"/>
+        </w:rPr>
+        <w:lastRenderedPageBreak/>
+        <w:t>Zou, A., Wang, Z., Kolter, J.Z., Fredrikson, M. (2023). Universal and Transferable Adversarial Attacks on Aligned Language Models. arXiv:2307.15043</w:t>
       </w:r>
     </w:p>
     <w:p>
       <w:pPr>
         <w:numPr>
           <w:ilvl w:val="0"/>
-          <w:numId w:val="1"/>
+          <w:numId w:val="10"/>
         </w:numPr>
         <w:rPr>
           <w:rFonts w:ascii="Old Standard TT" w:eastAsia="Old Standard TT" w:hAnsi="Old Standard TT" w:cs="Old Standard TT"/>
-        </w:rPr>
-      </w:pPr>
-      <w:r>
-        <w:rPr>
-          <w:rFonts w:ascii="Old Standard TT" w:eastAsia="Old Standard TT" w:hAnsi="Old Standard TT" w:cs="Old Standard TT"/>
-          <w:i/>
-          <w:iCs/>
-        </w:rPr>
-        <w:t>...</w:t>
+          <w:lang w:val="en-ZA"/>
+        </w:rPr>
+      </w:pPr>
+      <w:r>
+        <w:rPr>
+          <w:rFonts w:ascii="Old Standard TT" w:eastAsia="Old Standard TT" w:hAnsi="Old Standard TT" w:cs="Old Standard TT"/>
+          <w:lang w:val="en-ZA"/>
+        </w:rPr>
+        <w:t xml:space="preserve">Han, S., Rao, A., et al. (2024). </w:t>
+      </w:r>
+      <w:proofErr w:type="spellStart"/>
+      <w:r>
+        <w:rPr>
+          <w:rFonts w:ascii="Old Standard TT" w:eastAsia="Old Standard TT" w:hAnsi="Old Standard TT" w:cs="Old Standard TT"/>
+          <w:lang w:val="en-ZA"/>
+        </w:rPr>
+        <w:t>WildGuard</w:t>
+      </w:r>
+      <w:proofErr w:type="spellEnd"/>
+      <w:r>
+        <w:rPr>
+          <w:rFonts w:ascii="Old Standard TT" w:eastAsia="Old Standard TT" w:hAnsi="Old Standard TT" w:cs="Old Standard TT"/>
+          <w:lang w:val="en-ZA"/>
+        </w:rPr>
+        <w:t>: Open One-Stop Moderation Tools for Safety Risks, Jailbreaks, and Refusals of LLMs. arXiv:2406.18495</w:t>
+      </w:r>
+    </w:p>
+    <w:p>
+      <w:pPr>
+        <w:numPr>
+          <w:ilvl w:val="0"/>
+          <w:numId w:val="10"/>
+        </w:numPr>
+        <w:rPr>
+          <w:rFonts w:ascii="Old Standard TT" w:eastAsia="Old Standard TT" w:hAnsi="Old Standard TT" w:cs="Old Standard TT"/>
+          <w:lang w:val="en-ZA"/>
+        </w:rPr>
+      </w:pPr>
+      <w:r>
+        <w:rPr>
+          <w:rFonts w:ascii="Old Standard TT" w:eastAsia="Old Standard TT" w:hAnsi="Old Standard TT" w:cs="Old Standard TT"/>
+          <w:lang w:val="en-ZA"/>
+        </w:rPr>
+        <w:t>Yong, Z.X., Menghini, C., Bach, S.H. (2023). Low-Resource Languages Jailbreak GPT-4. </w:t>
+      </w:r>
+      <w:proofErr w:type="spellStart"/>
+      <w:r>
+        <w:rPr>
+          <w:rFonts w:ascii="Old Standard TT" w:eastAsia="Old Standard TT" w:hAnsi="Old Standard TT" w:cs="Old Standard TT"/>
+          <w:lang w:val="en-ZA"/>
+        </w:rPr>
+        <w:t>NeurIPS</w:t>
+      </w:r>
+      <w:proofErr w:type="spellEnd"/>
+      <w:r>
+        <w:rPr>
+          <w:rFonts w:ascii="Old Standard TT" w:eastAsia="Old Standard TT" w:hAnsi="Old Standard TT" w:cs="Old Standard TT"/>
+          <w:lang w:val="en-ZA"/>
+        </w:rPr>
+        <w:t xml:space="preserve"> 2023 </w:t>
+      </w:r>
+      <w:proofErr w:type="spellStart"/>
+      <w:r>
+        <w:rPr>
+          <w:rFonts w:ascii="Old Standard TT" w:eastAsia="Old Standard TT" w:hAnsi="Old Standard TT" w:cs="Old Standard TT"/>
+          <w:lang w:val="en-ZA"/>
+        </w:rPr>
+        <w:t>SoLaR</w:t>
+      </w:r>
+      <w:proofErr w:type="spellEnd"/>
+      <w:r>
+        <w:rPr>
+          <w:rFonts w:ascii="Old Standard TT" w:eastAsia="Old Standard TT" w:hAnsi="Old Standard TT" w:cs="Old Standard TT"/>
+          <w:lang w:val="en-ZA"/>
+        </w:rPr>
+        <w:t xml:space="preserve"> Workshop. arXiv:2310.02446</w:t>
+      </w:r>
+    </w:p>
+    <w:p>
+      <w:pPr>
+        <w:numPr>
+          <w:ilvl w:val="0"/>
+          <w:numId w:val="10"/>
+        </w:numPr>
+        <w:rPr>
+          <w:rFonts w:ascii="Old Standard TT" w:eastAsia="Old Standard TT" w:hAnsi="Old Standard TT" w:cs="Old Standard TT"/>
+          <w:lang w:val="en-ZA"/>
+        </w:rPr>
+      </w:pPr>
+      <w:r>
+        <w:rPr>
+          <w:rFonts w:ascii="Old Standard TT" w:eastAsia="Old Standard TT" w:hAnsi="Old Standard TT" w:cs="Old Standard TT"/>
+          <w:lang w:val="en-ZA"/>
+        </w:rPr>
+        <w:t>Shen, X., Chen, Z., Backes, M., Shen, Y., Zhang, Y. (2023). "Do Anything Now": Characterizing and Evaluating In-The-Wild Jailbreak Prompts on Large Language Models. arXiv:2308.03825</w:t>
+      </w:r>
+    </w:p>
+    <w:p>
+      <w:pPr>
+        <w:numPr>
+          <w:ilvl w:val="0"/>
+          <w:numId w:val="10"/>
+        </w:numPr>
+        <w:rPr>
+          <w:rFonts w:ascii="Old Standard TT" w:eastAsia="Old Standard TT" w:hAnsi="Old Standard TT" w:cs="Old Standard TT"/>
+          <w:lang w:val="en-ZA"/>
+        </w:rPr>
+      </w:pPr>
+      <w:proofErr w:type="spellStart"/>
+      <w:r>
+        <w:rPr>
+          <w:rFonts w:ascii="Old Standard TT" w:eastAsia="Old Standard TT" w:hAnsi="Old Standard TT" w:cs="Old Standard TT"/>
+          <w:lang w:val="en-ZA"/>
+        </w:rPr>
+        <w:t>Nekoto</w:t>
+      </w:r>
+      <w:proofErr w:type="spellEnd"/>
+      <w:r>
+        <w:rPr>
+          <w:rFonts w:ascii="Old Standard TT" w:eastAsia="Old Standard TT" w:hAnsi="Old Standard TT" w:cs="Old Standard TT"/>
+          <w:lang w:val="en-ZA"/>
+        </w:rPr>
+        <w:t>, W., et al. (2020). Participatory Research for Low-resourced Machine Translation: A Case Study in African Languages. Findings of EMNLP 2020. arXiv:2010.02353</w:t>
+      </w:r>
+    </w:p>
+    <w:p>
+      <w:pPr>
+        <w:numPr>
+          <w:ilvl w:val="0"/>
+          <w:numId w:val="10"/>
+        </w:numPr>
+        <w:rPr>
+          <w:rFonts w:ascii="Old Standard TT" w:eastAsia="Old Standard TT" w:hAnsi="Old Standard TT" w:cs="Old Standard TT"/>
+          <w:lang w:val="en-ZA"/>
+        </w:rPr>
+      </w:pPr>
+      <w:r>
+        <w:rPr>
+          <w:rFonts w:ascii="Old Standard TT" w:eastAsia="Old Standard TT" w:hAnsi="Old Standard TT" w:cs="Old Standard TT"/>
+          <w:lang w:val="en-ZA"/>
+        </w:rPr>
+        <w:t>Gao, L., et al. (2023). A Framework for Few-Shot Language Model Evaluation. </w:t>
+      </w:r>
+      <w:proofErr w:type="spellStart"/>
+      <w:r>
+        <w:rPr>
+          <w:rFonts w:ascii="Old Standard TT" w:eastAsia="Old Standard TT" w:hAnsi="Old Standard TT" w:cs="Old Standard TT"/>
+          <w:lang w:val="en-ZA"/>
+        </w:rPr>
+        <w:t>Zenodo</w:t>
+      </w:r>
+      <w:proofErr w:type="spellEnd"/>
+      <w:r>
+        <w:rPr>
+          <w:rFonts w:ascii="Old Standard TT" w:eastAsia="Old Standard TT" w:hAnsi="Old Standard TT" w:cs="Old Standard TT"/>
+          <w:lang w:val="en-ZA"/>
+        </w:rPr>
+        <w:t>. </w:t>
+      </w:r>
+      <w:hyperlink r:id="rId13" w:tgtFrame="_blank" w:history="1">
+        <w:r>
+          <w:rPr>
+            <w:rStyle w:val="Hyperlink"/>
+            <w:rFonts w:ascii="Old Standard TT" w:eastAsia="Old Standard TT" w:hAnsi="Old Standard TT" w:cs="Old Standard TT"/>
+            <w:lang w:val="en-ZA"/>
+          </w:rPr>
+          <w:t>https://doi.org/10.5281/zenodo.10256836</w:t>
+        </w:r>
+      </w:hyperlink>
+    </w:p>
+    <w:p>
+      <w:pPr>
+        <w:numPr>
+          <w:ilvl w:val="0"/>
+          <w:numId w:val="10"/>
+        </w:numPr>
+        <w:rPr>
+          <w:rFonts w:ascii="Old Standard TT" w:eastAsia="Old Standard TT" w:hAnsi="Old Standard TT" w:cs="Old Standard TT"/>
+          <w:lang w:val="en-ZA"/>
+        </w:rPr>
+      </w:pPr>
+      <w:r>
+        <w:rPr>
+          <w:rFonts w:ascii="Old Standard TT" w:eastAsia="Old Standard TT" w:hAnsi="Old Standard TT" w:cs="Old Standard TT"/>
+          <w:lang w:val="en-ZA"/>
+        </w:rPr>
+        <w:t>Liang, P., et al. (2022). Holistic Evaluation of Language Models. arXiv:2211.09110</w:t>
       </w:r>
     </w:p>
     <w:p>
@@ -5696,8 +5885,8 @@
           <w:szCs w:val="28"/>
         </w:rPr>
       </w:pPr>
-      <w:bookmarkStart w:id="15" w:name="_q3i2vokodzdm" w:colFirst="0" w:colLast="0"/>
-      <w:bookmarkEnd w:id="15"/>
+      <w:bookmarkStart w:id="14" w:name="_q3i2vokodzdm" w:colFirst="0" w:colLast="0"/>
+      <w:bookmarkEnd w:id="14"/>
       <w:r>
         <w:rPr>
           <w:rFonts w:ascii="Old Standard TT" w:eastAsia="Old Standard TT" w:hAnsi="Old Standard TT" w:cs="Old Standard TT"/>
@@ -5753,8 +5942,8 @@
           <w:szCs w:val="28"/>
         </w:rPr>
       </w:pPr>
-      <w:bookmarkStart w:id="16" w:name="_pqm421e0rdhv" w:colFirst="0" w:colLast="0"/>
-      <w:bookmarkEnd w:id="16"/>
+      <w:bookmarkStart w:id="15" w:name="_pqm421e0rdhv" w:colFirst="0" w:colLast="0"/>
+      <w:bookmarkEnd w:id="15"/>
       <w:r>
         <w:rPr>
           <w:rFonts w:ascii="Old Standard TT" w:eastAsia="Old Standard TT" w:hAnsi="Old Standard TT" w:cs="Old Standard TT"/>
@@ -5894,65 +6083,6 @@
       </w:r>
     </w:p>
   </w:footnote>
-  <w:footnote w:id="1">
-    <w:p>
-      <w:pPr>
-        <w:spacing w:after="200" w:line="240" w:lineRule="auto"/>
-        <w:rPr>
-          <w:rFonts w:ascii="Old Standard TT" w:eastAsia="Old Standard TT" w:hAnsi="Old Standard TT" w:cs="Old Standard TT"/>
-          <w:sz w:val="20"/>
-          <w:szCs w:val="20"/>
-          <w:shd w:val="clear" w:color="auto" w:fill="F4CCCC"/>
-        </w:rPr>
-      </w:pPr>
-      <w:r>
-        <w:rPr>
-          <w:vertAlign w:val="superscript"/>
-        </w:rPr>
-        <w:footnoteRef/>
-      </w:r>
-      <w:r>
-        <w:rPr>
-          <w:rFonts w:ascii="Old Standard TT" w:eastAsia="Old Standard TT" w:hAnsi="Old Standard TT" w:cs="Old Standard TT"/>
-          <w:sz w:val="20"/>
-          <w:szCs w:val="20"/>
-        </w:rPr>
-        <w:t xml:space="preserve"> Research conducted at the </w:t>
-      </w:r>
-      <w:hyperlink r:id="rId1">
-        <w:proofErr w:type="spellStart"/>
-        <w:r>
-          <w:rPr>
-            <w:rFonts w:ascii="Old Standard TT" w:eastAsia="Old Standard TT" w:hAnsi="Old Standard TT" w:cs="Old Standard TT"/>
-            <w:color w:val="1155CC"/>
-            <w:sz w:val="20"/>
-            <w:szCs w:val="20"/>
-            <w:u w:val="single"/>
-          </w:rPr>
-          <w:t>The</w:t>
-        </w:r>
-        <w:proofErr w:type="spellEnd"/>
-        <w:r>
-          <w:rPr>
-            <w:rFonts w:ascii="Old Standard TT" w:eastAsia="Old Standard TT" w:hAnsi="Old Standard TT" w:cs="Old Standard TT"/>
-            <w:color w:val="1155CC"/>
-            <w:sz w:val="20"/>
-            <w:szCs w:val="20"/>
-            <w:u w:val="single"/>
-          </w:rPr>
-          <w:t xml:space="preserve"> Global South AI Safety Hackathon</w:t>
-        </w:r>
-      </w:hyperlink>
-      <w:r>
-        <w:rPr>
-          <w:rFonts w:ascii="Old Standard TT" w:eastAsia="Old Standard TT" w:hAnsi="Old Standard TT" w:cs="Old Standard TT"/>
-          <w:sz w:val="20"/>
-          <w:szCs w:val="20"/>
-        </w:rPr>
-        <w:t>, June 2026</w:t>
-      </w:r>
-    </w:p>
-  </w:footnote>
 </w:footnotes>
 </file>
 
@@ -6108,6 +6238,155 @@
     </w:lvl>
   </w:abstractNum>
   <w:abstractNum w:abstractNumId="1" w15:restartNumberingAfterBreak="0">
+    <w:nsid w:val="1A782107"/>
+    <w:multiLevelType w:val="multilevel"/>
+    <w:tmpl w:val="A5E86738"/>
+    <w:lvl w:ilvl="0">
+      <w:start w:val="1"/>
+      <w:numFmt w:val="bullet"/>
+      <w:lvlText w:val=""/>
+      <w:lvlJc w:val="left"/>
+      <w:pPr>
+        <w:tabs>
+          <w:tab w:val="num" w:pos="720"/>
+        </w:tabs>
+        <w:ind w:left="720" w:hanging="360"/>
+      </w:pPr>
+      <w:rPr>
+        <w:rFonts w:ascii="Symbol" w:hAnsi="Symbol" w:hint="default"/>
+        <w:sz w:val="20"/>
+      </w:rPr>
+    </w:lvl>
+    <w:lvl w:ilvl="1" w:tentative="1">
+      <w:start w:val="1"/>
+      <w:numFmt w:val="bullet"/>
+      <w:lvlText w:val="o"/>
+      <w:lvlJc w:val="left"/>
+      <w:pPr>
+        <w:tabs>
+          <w:tab w:val="num" w:pos="1440"/>
+        </w:tabs>
+        <w:ind w:left="1440" w:hanging="360"/>
+      </w:pPr>
+      <w:rPr>
+        <w:rFonts w:ascii="Courier New" w:hAnsi="Courier New" w:hint="default"/>
+        <w:sz w:val="20"/>
+      </w:rPr>
+    </w:lvl>
+    <w:lvl w:ilvl="2" w:tentative="1">
+      <w:start w:val="1"/>
+      <w:numFmt w:val="bullet"/>
+      <w:lvlText w:val=""/>
+      <w:lvlJc w:val="left"/>
+      <w:pPr>
+        <w:tabs>
+          <w:tab w:val="num" w:pos="2160"/>
+        </w:tabs>
+        <w:ind w:left="2160" w:hanging="360"/>
+      </w:pPr>
+      <w:rPr>
+        <w:rFonts w:ascii="Wingdings" w:hAnsi="Wingdings" w:hint="default"/>
+        <w:sz w:val="20"/>
+      </w:rPr>
+    </w:lvl>
+    <w:lvl w:ilvl="3" w:tentative="1">
+      <w:start w:val="1"/>
+      <w:numFmt w:val="bullet"/>
+      <w:lvlText w:val=""/>
+      <w:lvlJc w:val="left"/>
+      <w:pPr>
+        <w:tabs>
+          <w:tab w:val="num" w:pos="2880"/>
+        </w:tabs>
+        <w:ind w:left="2880" w:hanging="360"/>
+      </w:pPr>
+      <w:rPr>
+        <w:rFonts w:ascii="Wingdings" w:hAnsi="Wingdings" w:hint="default"/>
+        <w:sz w:val="20"/>
+      </w:rPr>
+    </w:lvl>
+    <w:lvl w:ilvl="4" w:tentative="1">
+      <w:start w:val="1"/>
+      <w:numFmt w:val="bullet"/>
+      <w:lvlText w:val=""/>
+      <w:lvlJc w:val="left"/>
+      <w:pPr>
+        <w:tabs>
+          <w:tab w:val="num" w:pos="3600"/>
+        </w:tabs>
+        <w:ind w:left="3600" w:hanging="360"/>
+      </w:pPr>
+      <w:rPr>
+        <w:rFonts w:ascii="Wingdings" w:hAnsi="Wingdings" w:hint="default"/>
+        <w:sz w:val="20"/>
+      </w:rPr>
+    </w:lvl>
+    <w:lvl w:ilvl="5" w:tentative="1">
+      <w:start w:val="1"/>
+      <w:numFmt w:val="bullet"/>
+      <w:lvlText w:val=""/>
+      <w:lvlJc w:val="left"/>
+      <w:pPr>
+        <w:tabs>
+          <w:tab w:val="num" w:pos="4320"/>
+        </w:tabs>
+        <w:ind w:left="4320" w:hanging="360"/>
+      </w:pPr>
+      <w:rPr>
+        <w:rFonts w:ascii="Wingdings" w:hAnsi="Wingdings" w:hint="default"/>
+        <w:sz w:val="20"/>
+      </w:rPr>
+    </w:lvl>
+    <w:lvl w:ilvl="6" w:tentative="1">
+      <w:start w:val="1"/>
+      <w:numFmt w:val="bullet"/>
+      <w:lvlText w:val=""/>
+      <w:lvlJc w:val="left"/>
+      <w:pPr>
+        <w:tabs>
+          <w:tab w:val="num" w:pos="5040"/>
+        </w:tabs>
+        <w:ind w:left="5040" w:hanging="360"/>
+      </w:pPr>
+      <w:rPr>
+        <w:rFonts w:ascii="Wingdings" w:hAnsi="Wingdings" w:hint="default"/>
+        <w:sz w:val="20"/>
+      </w:rPr>
+    </w:lvl>
+    <w:lvl w:ilvl="7" w:tentative="1">
+      <w:start w:val="1"/>
+      <w:numFmt w:val="bullet"/>
+      <w:lvlText w:val=""/>
+      <w:lvlJc w:val="left"/>
+      <w:pPr>
+        <w:tabs>
+          <w:tab w:val="num" w:pos="5760"/>
+        </w:tabs>
+        <w:ind w:left="5760" w:hanging="360"/>
+      </w:pPr>
+      <w:rPr>
+        <w:rFonts w:ascii="Wingdings" w:hAnsi="Wingdings" w:hint="default"/>
+        <w:sz w:val="20"/>
+      </w:rPr>
+    </w:lvl>
+    <w:lvl w:ilvl="8" w:tentative="1">
+      <w:start w:val="1"/>
+      <w:numFmt w:val="bullet"/>
+      <w:lvlText w:val=""/>
+      <w:lvlJc w:val="left"/>
+      <w:pPr>
+        <w:tabs>
+          <w:tab w:val="num" w:pos="6480"/>
+        </w:tabs>
+        <w:ind w:left="6480" w:hanging="360"/>
+      </w:pPr>
+      <w:rPr>
+        <w:rFonts w:ascii="Wingdings" w:hAnsi="Wingdings" w:hint="default"/>
+        <w:sz w:val="20"/>
+      </w:rPr>
+    </w:lvl>
+  </w:abstractNum>
+  <w:abstractNum w:abstractNumId="2" w15:restartNumberingAfterBreak="0">
     <w:nsid w:val="1BF2369E"/>
     <w:multiLevelType w:val="multilevel"/>
     <w:tmpl w:val="03CC1C72"/>
@@ -6220,7 +6499,7 @@
       </w:rPr>
     </w:lvl>
   </w:abstractNum>
-  <w:abstractNum w:abstractNumId="2" w15:restartNumberingAfterBreak="0">
+  <w:abstractNum w:abstractNumId="3" w15:restartNumberingAfterBreak="0">
     <w:nsid w:val="212960FB"/>
     <w:multiLevelType w:val="multilevel"/>
     <w:tmpl w:val="1016795C"/>
@@ -6333,7 +6612,7 @@
       </w:rPr>
     </w:lvl>
   </w:abstractNum>
-  <w:abstractNum w:abstractNumId="3" w15:restartNumberingAfterBreak="0">
+  <w:abstractNum w:abstractNumId="4" w15:restartNumberingAfterBreak="0">
     <w:nsid w:val="3AD36192"/>
     <w:multiLevelType w:val="multilevel"/>
     <w:tmpl w:val="F93E81D6"/>
@@ -6446,7 +6725,7 @@
       </w:rPr>
     </w:lvl>
   </w:abstractNum>
-  <w:abstractNum w:abstractNumId="4" w15:restartNumberingAfterBreak="0">
+  <w:abstractNum w:abstractNumId="5" w15:restartNumberingAfterBreak="0">
     <w:nsid w:val="3BD35F5C"/>
     <w:multiLevelType w:val="multilevel"/>
     <w:tmpl w:val="38706FF6"/>
@@ -6559,7 +6838,7 @@
       </w:rPr>
     </w:lvl>
   </w:abstractNum>
-  <w:abstractNum w:abstractNumId="5" w15:restartNumberingAfterBreak="0">
+  <w:abstractNum w:abstractNumId="6" w15:restartNumberingAfterBreak="0">
     <w:nsid w:val="3F124CEA"/>
     <w:multiLevelType w:val="multilevel"/>
     <w:tmpl w:val="0A9A3BDC"/>
@@ -6708,7 +6987,120 @@
       </w:rPr>
     </w:lvl>
   </w:abstractNum>
-  <w:abstractNum w:abstractNumId="6" w15:restartNumberingAfterBreak="0">
+  <w:abstractNum w:abstractNumId="7" w15:restartNumberingAfterBreak="0">
+    <w:nsid w:val="4B9E4421"/>
+    <w:multiLevelType w:val="multilevel"/>
+    <w:tmpl w:val="ABDC9E78"/>
+    <w:lvl w:ilvl="0">
+      <w:start w:val="1"/>
+      <w:numFmt w:val="decimal"/>
+      <w:lvlText w:val="%1."/>
+      <w:lvlJc w:val="left"/>
+      <w:pPr>
+        <w:tabs>
+          <w:tab w:val="num" w:pos="720"/>
+        </w:tabs>
+        <w:ind w:left="720" w:hanging="360"/>
+      </w:pPr>
+    </w:lvl>
+    <w:lvl w:ilvl="1" w:tentative="1">
+      <w:start w:val="1"/>
+      <w:numFmt w:val="decimal"/>
+      <w:lvlText w:val="%2."/>
+      <w:lvlJc w:val="left"/>
+      <w:pPr>
+        <w:tabs>
+          <w:tab w:val="num" w:pos="1440"/>
+        </w:tabs>
+        <w:ind w:left="1440" w:hanging="360"/>
+      </w:pPr>
+    </w:lvl>
+    <w:lvl w:ilvl="2" w:tentative="1">
+      <w:start w:val="1"/>
+      <w:numFmt w:val="decimal"/>
+      <w:lvlText w:val="%3."/>
+      <w:lvlJc w:val="left"/>
+      <w:pPr>
+        <w:tabs>
+          <w:tab w:val="num" w:pos="2160"/>
+        </w:tabs>
+        <w:ind w:left="2160" w:hanging="360"/>
+      </w:pPr>
+    </w:lvl>
+    <w:lvl w:ilvl="3" w:tentative="1">
+      <w:start w:val="1"/>
+      <w:numFmt w:val="decimal"/>
+      <w:lvlText w:val="%4."/>
+      <w:lvlJc w:val="left"/>
+      <w:pPr>
+        <w:tabs>
+          <w:tab w:val="num" w:pos="2880"/>
+        </w:tabs>
+        <w:ind w:left="2880" w:hanging="360"/>
+      </w:pPr>
+    </w:lvl>
+    <w:lvl w:ilvl="4" w:tentative="1">
+      <w:start w:val="1"/>
+      <w:numFmt w:val="decimal"/>
+      <w:lvlText w:val="%5."/>
+      <w:lvlJc w:val="left"/>
+      <w:pPr>
+        <w:tabs>
+          <w:tab w:val="num" w:pos="3600"/>
+        </w:tabs>
+        <w:ind w:left="3600" w:hanging="360"/>
+      </w:pPr>
+    </w:lvl>
+    <w:lvl w:ilvl="5" w:tentative="1">
+      <w:start w:val="1"/>
+      <w:numFmt w:val="decimal"/>
+      <w:lvlText w:val="%6."/>
+      <w:lvlJc w:val="left"/>
+      <w:pPr>
+        <w:tabs>
+          <w:tab w:val="num" w:pos="4320"/>
+        </w:tabs>
+        <w:ind w:left="4320" w:hanging="360"/>
+      </w:pPr>
+    </w:lvl>
+    <w:lvl w:ilvl="6" w:tentative="1">
+      <w:start w:val="1"/>
+      <w:numFmt w:val="decimal"/>
+      <w:lvlText w:val="%7."/>
+      <w:lvlJc w:val="left"/>
+      <w:pPr>
+        <w:tabs>
+          <w:tab w:val="num" w:pos="5040"/>
+        </w:tabs>
+        <w:ind w:left="5040" w:hanging="360"/>
+      </w:pPr>
+    </w:lvl>
+    <w:lvl w:ilvl="7" w:tentative="1">
+      <w:start w:val="1"/>
+      <w:numFmt w:val="decimal"/>
+      <w:lvlText w:val="%8."/>
+      <w:lvlJc w:val="left"/>
+      <w:pPr>
+        <w:tabs>
+          <w:tab w:val="num" w:pos="5760"/>
+        </w:tabs>
+        <w:ind w:left="5760" w:hanging="360"/>
+      </w:pPr>
+    </w:lvl>
+    <w:lvl w:ilvl="8" w:tentative="1">
+      <w:start w:val="1"/>
+      <w:numFmt w:val="decimal"/>
+      <w:lvlText w:val="%9."/>
+      <w:lvlJc w:val="left"/>
+      <w:pPr>
+        <w:tabs>
+          <w:tab w:val="num" w:pos="6480"/>
+        </w:tabs>
+        <w:ind w:left="6480" w:hanging="360"/>
+      </w:pPr>
+    </w:lvl>
+  </w:abstractNum>
+  <w:abstractNum w:abstractNumId="8" w15:restartNumberingAfterBreak="0">
     <w:nsid w:val="5C8804D0"/>
     <w:multiLevelType w:val="multilevel"/>
     <w:tmpl w:val="B360E064"/>
@@ -6821,7 +7213,7 @@
       </w:pPr>
     </w:lvl>
   </w:abstractNum>
-  <w:abstractNum w:abstractNumId="7" w15:restartNumberingAfterBreak="0">
+  <w:abstractNum w:abstractNumId="9" w15:restartNumberingAfterBreak="0">
     <w:nsid w:val="5E721726"/>
     <w:multiLevelType w:val="multilevel"/>
     <w:tmpl w:val="9C1C8852"/>
@@ -6970,7 +7362,7 @@
       </w:rPr>
     </w:lvl>
   </w:abstractNum>
-  <w:abstractNum w:abstractNumId="8" w15:restartNumberingAfterBreak="0">
+  <w:abstractNum w:abstractNumId="10" w15:restartNumberingAfterBreak="0">
     <w:nsid w:val="7DB00BFA"/>
     <w:multiLevelType w:val="multilevel"/>
     <w:tmpl w:val="6FD6F832"/>
@@ -7084,31 +7476,37 @@
     </w:lvl>
   </w:abstractNum>
   <w:num w:numId="1" w16cid:durableId="1055860634">
+    <w:abstractNumId w:val="3"/>
+  </w:num>
+  <w:num w:numId="2" w16cid:durableId="2110856402">
+    <w:abstractNumId w:val="5"/>
+  </w:num>
+  <w:num w:numId="3" w16cid:durableId="707605936">
     <w:abstractNumId w:val="2"/>
   </w:num>
-  <w:num w:numId="2" w16cid:durableId="2110856402">
+  <w:num w:numId="4" w16cid:durableId="1371537826">
     <w:abstractNumId w:val="4"/>
   </w:num>
-  <w:num w:numId="3" w16cid:durableId="707605936">
-    <w:abstractNumId w:val="1"/>
+  <w:num w:numId="5" w16cid:durableId="1219052223">
+    <w:abstractNumId w:val="10"/>
   </w:num>
-  <w:num w:numId="4" w16cid:durableId="1371537826">
-    <w:abstractNumId w:val="3"/>
+  <w:num w:numId="6" w16cid:durableId="437456815">
+    <w:abstractNumId w:val="9"/>
   </w:num>
-  <w:num w:numId="5" w16cid:durableId="1219052223">
+  <w:num w:numId="7" w16cid:durableId="124081794">
     <w:abstractNumId w:val="8"/>
   </w:num>
-  <w:num w:numId="6" w16cid:durableId="437456815">
-    <w:abstractNumId w:val="7"/>
-  </w:num>
-  <w:num w:numId="7" w16cid:durableId="124081794">
+  <w:num w:numId="8" w16cid:durableId="2065516422">
     <w:abstractNumId w:val="6"/>
-  </w:num>
-  <w:num w:numId="8" w16cid:durableId="2065516422">
-    <w:abstractNumId w:val="5"/>
   </w:num>
   <w:num w:numId="9" w16cid:durableId="96565343">
     <w:abstractNumId w:val="0"/>
+  </w:num>
+  <w:num w:numId="10" w16cid:durableId="1776172712">
+    <w:abstractNumId w:val="7"/>
+  </w:num>
+  <w:num w:numId="11" w16cid:durableId="746919885">
+    <w:abstractNumId w:val="1"/>
   </w:num>
 </w:numbering>
 </file>
@@ -7733,6 +8131,40 @@
       <w:tblStyleColBandSize w:val="1"/>
     </w:tblPr>
   </w:style>
+  <w:style w:type="character" w:styleId="Hyperlink">
+    <w:name w:val="Hyperlink"/>
+    <w:basedOn w:val="DefaultParagraphFont"/>
+    <w:uiPriority w:val="99"/>
+    <w:unhideWhenUsed/>
+    <w:rsid w:val="008C4DED"/>
+    <w:rPr>
+      <w:color w:val="0000FF" w:themeColor="hyperlink"/>
+      <w:u w:val="single"/>
+    </w:rPr>
+  </w:style>
+  <w:style w:type="character" w:styleId="UnresolvedMention">
+    <w:name w:val="Unresolved Mention"/>
+    <w:basedOn w:val="DefaultParagraphFont"/>
+    <w:uiPriority w:val="99"/>
+    <w:semiHidden/>
+    <w:unhideWhenUsed/>
+    <w:rsid w:val="008C4DED"/>
+    <w:rPr>
+      <w:color w:val="605E5C"/>
+      <w:shd w:val="clear" w:color="auto" w:fill="E1DFDD"/>
+    </w:rPr>
+  </w:style>
+  <w:style w:type="paragraph" w:styleId="ListParagraph">
+    <w:name w:val="List Paragraph"/>
+    <w:basedOn w:val="Normal"/>
+    <w:uiPriority w:val="34"/>
+    <w:qFormat/>
+    <w:rsid w:val="00453F01"/>
+    <w:pPr>
+      <w:ind w:left="720"/>
+      <w:contextualSpacing/>
+    </w:pPr>
+  </w:style>
 </w:styles>
 </file>
 
@@ -8054,4 +8486,16 @@
   </a:objectDefaults>
   <a:extraClrSchemeLst/>
 </a:theme>
+</file>
+
+<file path=customXml/item1.xml><?xml version="1.0" encoding="utf-8"?>
+<b:Sources xmlns:b="http://schemas.openxmlformats.org/officeDocument/2006/bibliography" xmlns="http://schemas.openxmlformats.org/officeDocument/2006/bibliography" SelectedStyle="\APASixthEditionOfficeOnline.xsl" StyleName="APA" Version="6"/>
+</file>
+
+<file path=customXml/itemProps1.xml><?xml version="1.0" encoding="utf-8"?>
+<ds:datastoreItem xmlns:ds="http://schemas.openxmlformats.org/officeDocument/2006/customXml" ds:itemID="{FEF57175-4BF1-4B4E-ADFE-81C57F2F9FCA}">
+  <ds:schemaRefs>
+    <ds:schemaRef ds:uri="http://schemas.openxmlformats.org/officeDocument/2006/bibliography"/>
+  </ds:schemaRefs>
+</ds:datastoreItem>
 </file>
</xml_diff>